<commit_message>
Update Table 2 with equations
</commit_message>
<xml_diff>
--- a/docs/dirichlet-comparison-manuscript-v3.docx
+++ b/docs/dirichlet-comparison-manuscript-v3.docx
@@ -15,7 +15,35 @@
           <w:b/>
           <w:sz w:val="36"/>
         </w:rPr>
-        <w:t xml:space="preserve">Comparing Dirichlet-Multinomial Parameterizations </w:t>
+        <w:t>Comparing Dirichlet-</w:t>
+      </w:r>
+      <w:r>
+        <w:rPr>
+          <w:b/>
+          <w:sz w:val="36"/>
+        </w:rPr>
+        <w:t>m</w:t>
+      </w:r>
+      <w:r>
+        <w:rPr>
+          <w:b/>
+          <w:sz w:val="36"/>
+        </w:rPr>
+        <w:t xml:space="preserve">ultinomial </w:t>
+      </w:r>
+      <w:r>
+        <w:rPr>
+          <w:b/>
+          <w:sz w:val="36"/>
+        </w:rPr>
+        <w:t>p</w:t>
+      </w:r>
+      <w:r>
+        <w:rPr>
+          <w:b/>
+          <w:sz w:val="36"/>
+        </w:rPr>
+        <w:t xml:space="preserve">arameterizations </w:t>
       </w:r>
     </w:p>
     <w:p>
@@ -27,7 +55,49 @@
           <w:b/>
           <w:sz w:val="36"/>
         </w:rPr>
-        <w:t>for Composition Data</w:t>
+        <w:t xml:space="preserve">for </w:t>
+      </w:r>
+      <w:r>
+        <w:rPr>
+          <w:b/>
+          <w:sz w:val="36"/>
+        </w:rPr>
+        <w:t>f</w:t>
+      </w:r>
+      <w:r>
+        <w:rPr>
+          <w:b/>
+          <w:sz w:val="36"/>
+        </w:rPr>
+        <w:t xml:space="preserve">itting </w:t>
+      </w:r>
+      <w:r>
+        <w:rPr>
+          <w:b/>
+          <w:sz w:val="36"/>
+        </w:rPr>
+        <w:t>c</w:t>
+      </w:r>
+      <w:r>
+        <w:rPr>
+          <w:b/>
+          <w:sz w:val="36"/>
+        </w:rPr>
+        <w:t xml:space="preserve">omposition </w:t>
+      </w:r>
+      <w:r>
+        <w:rPr>
+          <w:b/>
+          <w:sz w:val="36"/>
+        </w:rPr>
+        <w:t>d</w:t>
+      </w:r>
+      <w:r>
+        <w:rPr>
+          <w:b/>
+          <w:sz w:val="36"/>
+        </w:rPr>
+        <w:t>ata</w:t>
       </w:r>
     </w:p>
     <w:p>

</xml_diff>